<commit_message>
Replace navy packaging palette with the channel's warm system
Nothing on the channel uses navy. The packaging skill's stated palette
(navy/gold/cool) did not match any live thumbnail, so a fresh run would
start from the wrong art direction.

- SKILL.md: warm palette sampled from live frames, plus the three rules
  the shipped thumbnails all follow (one accent move per frame, type
  overlaps the talent, case is a free choice)
- SKILL.md: render command moved from wkhtmltoimage to headless Chromium,
  including the 1280x900-then-crop step for the short headless viewport
- Deliverable headings now warm espresso rather than navy

Disclaimer re-verified byte-exact after the rebuild.

Co-Authored-By: Claude Opus 5 <noreply@anthropic.com>
Claude-Session: https://claude.ai/code/session_017i4USMd5pgTL8z8Kaa9BGb
</commit_message>
<xml_diff>
--- a/5-Signs-Not-Ready-to-Retire-Packaging.docx
+++ b/5-Signs-Not-Ready-to-Retire-Packaging.docx
@@ -12,7 +12,7 @@
           <w:rFonts w:ascii="Arial" w:cs="Arial" w:eastAsia="Arial" w:hAnsi="Arial"/>
           <w:b/>
           <w:bCs/>
-          <w:color w:val="0E2A47"/>
+          <w:color w:val="4A3F36"/>
           <w:sz w:val="36"/>
           <w:szCs w:val="36"/>
         </w:rPr>
@@ -28,7 +28,7 @@
           <w:rFonts w:ascii="Arial" w:cs="Arial" w:eastAsia="Arial" w:hAnsi="Arial"/>
           <w:b/>
           <w:bCs/>
-          <w:color w:val="0E2A47"/>
+          <w:color w:val="4A3F36"/>
           <w:sz w:val="32"/>
           <w:szCs w:val="32"/>
         </w:rPr>
@@ -41,7 +41,7 @@
           <w:rFonts w:ascii="Arial" w:cs="Arial" w:eastAsia="Arial" w:hAnsi="Arial"/>
           <w:i/>
           <w:iCs/>
-          <w:color w:val="777777"/>
+          <w:color w:val="8A7F73"/>
           <w:sz w:val="18"/>
           <w:szCs w:val="18"/>
         </w:rPr>
@@ -537,7 +537,7 @@
           <w:rFonts w:ascii="Arial" w:cs="Arial" w:eastAsia="Arial" w:hAnsi="Arial"/>
           <w:b/>
           <w:bCs/>
-          <w:color w:val="0E2A47"/>
+          <w:color w:val="4A3F36"/>
           <w:sz w:val="32"/>
           <w:szCs w:val="32"/>
         </w:rPr>
@@ -632,7 +632,7 @@
                 <w:rFonts w:ascii="Arial" w:cs="Arial" w:eastAsia="Arial" w:hAnsi="Arial"/>
                 <w:i/>
                 <w:iCs/>
-                <w:color w:val="777777"/>
+                <w:color w:val="8A7F73"/>
                 <w:sz w:val="18"/>
                 <w:szCs w:val="18"/>
               </w:rPr>
@@ -711,7 +711,7 @@
                 <w:rFonts w:ascii="Arial" w:cs="Arial" w:eastAsia="Arial" w:hAnsi="Arial"/>
                 <w:i/>
                 <w:iCs/>
-                <w:color w:val="777777"/>
+                <w:color w:val="8A7F73"/>
                 <w:sz w:val="18"/>
                 <w:szCs w:val="18"/>
               </w:rPr>
@@ -792,7 +792,7 @@
                 <w:rFonts w:ascii="Arial" w:cs="Arial" w:eastAsia="Arial" w:hAnsi="Arial"/>
                 <w:i/>
                 <w:iCs/>
-                <w:color w:val="777777"/>
+                <w:color w:val="8A7F73"/>
                 <w:sz w:val="18"/>
                 <w:szCs w:val="18"/>
               </w:rPr>
@@ -871,7 +871,7 @@
                 <w:rFonts w:ascii="Arial" w:cs="Arial" w:eastAsia="Arial" w:hAnsi="Arial"/>
                 <w:i/>
                 <w:iCs/>
-                <w:color w:val="777777"/>
+                <w:color w:val="8A7F73"/>
                 <w:sz w:val="18"/>
                 <w:szCs w:val="18"/>
               </w:rPr>
@@ -895,7 +895,7 @@
           <w:rFonts w:ascii="Arial" w:cs="Arial" w:eastAsia="Arial" w:hAnsi="Arial"/>
           <w:b/>
           <w:bCs/>
-          <w:color w:val="0E2A47"/>
+          <w:color w:val="4A3F36"/>
           <w:sz w:val="32"/>
           <w:szCs w:val="32"/>
         </w:rPr>
@@ -1015,7 +1015,7 @@
           <w:rFonts w:ascii="Arial" w:cs="Arial" w:eastAsia="Arial" w:hAnsi="Arial"/>
           <w:b/>
           <w:bCs/>
-          <w:color w:val="0E2A47"/>
+          <w:color w:val="4A3F36"/>
           <w:sz w:val="32"/>
           <w:szCs w:val="32"/>
         </w:rPr>

</xml_diff>